<commit_message>
Fix formatting of PT and EN deliveries .docx files
</commit_message>
<xml_diff>
--- a/deliveries/cases/PT/1.docx
+++ b/deliveries/cases/PT/1.docx
@@ -68,6 +68,18 @@
           </wp:anchor>
         </w:drawing>
       </w:r>
+      <w:r>
+        <w:rPr>
+          <w:rFonts w:ascii="Arial" w:eastAsia="Arial" w:hAnsi="Arial" w:cs="Arial"/>
+          <w:b/>
+          <w:bCs/>
+          <w:color w:val="231F20"/>
+          <w:sz w:val="36"/>
+          <w:szCs w:val="36"/>
+          <w:lang w:val="pt-PT"/>
+        </w:rPr>
+        <w:tab/>
+      </w:r>
     </w:p>
     <w:p>
       <w:pPr>
@@ -1029,7 +1041,19 @@
               <w:rPr>
                 <w:rStyle w:val="Hyperlink"/>
               </w:rPr>
-              <w:t>Introdução</w:t>
+              <w:t>Intro</w:t>
+            </w:r>
+            <w:r>
+              <w:rPr>
+                <w:rStyle w:val="Hyperlink"/>
+              </w:rPr>
+              <w:t>d</w:t>
+            </w:r>
+            <w:r>
+              <w:rPr>
+                <w:rStyle w:val="Hyperlink"/>
+              </w:rPr>
+              <w:t>ução</w:t>
             </w:r>
             <w:r>
               <w:rPr>
@@ -2847,9 +2871,8 @@
         <w:pStyle w:val="Heading1"/>
         <w:numPr>
           <w:ilvl w:val="0"/>
-          <w:numId w:val="1"/>
+          <w:numId w:val="2"/>
         </w:numPr>
-        <w:ind w:left="0" w:firstLine="0"/>
         <w:rPr>
           <w:rFonts w:ascii="Arial" w:eastAsia="Arial" w:hAnsi="Arial" w:cs="Arial"/>
           <w:color w:val="231F20"/>
@@ -5144,8 +5167,100 @@
       </w:rPr>
     </w:lvl>
   </w:abstractNum>
+  <w:abstractNum w:abstractNumId="1" w15:restartNumberingAfterBreak="0">
+    <w:nsid w:val="759237EA"/>
+    <w:multiLevelType w:val="hybridMultilevel"/>
+    <w:tmpl w:val="C478B582"/>
+    <w:lvl w:ilvl="0" w:tplc="CD5A8084">
+      <w:start w:val="1"/>
+      <w:numFmt w:val="decimal"/>
+      <w:lvlText w:val="%1."/>
+      <w:lvlJc w:val="left"/>
+      <w:pPr>
+        <w:ind w:left="964" w:hanging="964"/>
+      </w:pPr>
+      <w:rPr>
+        <w:rFonts w:hint="default"/>
+      </w:rPr>
+    </w:lvl>
+    <w:lvl w:ilvl="1" w:tplc="04090019" w:tentative="1">
+      <w:start w:val="1"/>
+      <w:numFmt w:val="lowerLetter"/>
+      <w:lvlText w:val="%2."/>
+      <w:lvlJc w:val="left"/>
+      <w:pPr>
+        <w:ind w:left="1440" w:hanging="360"/>
+      </w:pPr>
+    </w:lvl>
+    <w:lvl w:ilvl="2" w:tplc="0409001B" w:tentative="1">
+      <w:start w:val="1"/>
+      <w:numFmt w:val="lowerRoman"/>
+      <w:lvlText w:val="%3."/>
+      <w:lvlJc w:val="right"/>
+      <w:pPr>
+        <w:ind w:left="2160" w:hanging="180"/>
+      </w:pPr>
+    </w:lvl>
+    <w:lvl w:ilvl="3" w:tplc="0409000F" w:tentative="1">
+      <w:start w:val="1"/>
+      <w:numFmt w:val="decimal"/>
+      <w:lvlText w:val="%4."/>
+      <w:lvlJc w:val="left"/>
+      <w:pPr>
+        <w:ind w:left="2880" w:hanging="360"/>
+      </w:pPr>
+    </w:lvl>
+    <w:lvl w:ilvl="4" w:tplc="04090019" w:tentative="1">
+      <w:start w:val="1"/>
+      <w:numFmt w:val="lowerLetter"/>
+      <w:lvlText w:val="%5."/>
+      <w:lvlJc w:val="left"/>
+      <w:pPr>
+        <w:ind w:left="3600" w:hanging="360"/>
+      </w:pPr>
+    </w:lvl>
+    <w:lvl w:ilvl="5" w:tplc="0409001B" w:tentative="1">
+      <w:start w:val="1"/>
+      <w:numFmt w:val="lowerRoman"/>
+      <w:lvlText w:val="%6."/>
+      <w:lvlJc w:val="right"/>
+      <w:pPr>
+        <w:ind w:left="4320" w:hanging="180"/>
+      </w:pPr>
+    </w:lvl>
+    <w:lvl w:ilvl="6" w:tplc="0409000F" w:tentative="1">
+      <w:start w:val="1"/>
+      <w:numFmt w:val="decimal"/>
+      <w:lvlText w:val="%7."/>
+      <w:lvlJc w:val="left"/>
+      <w:pPr>
+        <w:ind w:left="5040" w:hanging="360"/>
+      </w:pPr>
+    </w:lvl>
+    <w:lvl w:ilvl="7" w:tplc="04090019" w:tentative="1">
+      <w:start w:val="1"/>
+      <w:numFmt w:val="lowerLetter"/>
+      <w:lvlText w:val="%8."/>
+      <w:lvlJc w:val="left"/>
+      <w:pPr>
+        <w:ind w:left="5760" w:hanging="360"/>
+      </w:pPr>
+    </w:lvl>
+    <w:lvl w:ilvl="8" w:tplc="0409001B" w:tentative="1">
+      <w:start w:val="1"/>
+      <w:numFmt w:val="lowerRoman"/>
+      <w:lvlText w:val="%9."/>
+      <w:lvlJc w:val="right"/>
+      <w:pPr>
+        <w:ind w:left="6480" w:hanging="180"/>
+      </w:pPr>
+    </w:lvl>
+  </w:abstractNum>
   <w:num w:numId="1" w16cid:durableId="301932789">
     <w:abstractNumId w:val="0"/>
+  </w:num>
+  <w:num w:numId="2" w16cid:durableId="1195775960">
+    <w:abstractNumId w:val="1"/>
   </w:num>
 </w:numbering>
 </file>
@@ -5575,7 +5690,6 @@
     <w:name w:val="heading 2"/>
     <w:basedOn w:val="Normal"/>
     <w:next w:val="Normal"/>
-    <w:autoRedefine/>
     <w:uiPriority w:val="9"/>
     <w:unhideWhenUsed/>
     <w:qFormat/>

</xml_diff>